<commit_message>
Re-lay out worksheets: fewer sides, tasks kept on one side where it costs no paper
Co-Authored-By: Claude Opus 5.5 <noreply@anthropic.com>
Claude-Session: https://claude.ai/code/session_01WeyJoxdqkgaWP2E9bmUhY7
</commit_message>
<xml_diff>
--- a/e1/speaking-listening/docs/quiet-tasks-mixed-skills-worksheet.docx
+++ b/e1/speaking-listening/docs/quiet-tasks-mixed-skills-worksheet.docx
@@ -5,6 +5,7 @@
     <w:p>
       <w:pPr>
         <w:pStyle w:val="FirstParagraph"/>
+        <w:spacing w:before="0" w:after="60" w:line="240" w:lineRule="auto"/>
       </w:pPr>
       <w:r>
         <w:drawing>
@@ -53,6 +54,7 @@
     <w:p>
       <w:pPr>
         <w:pStyle w:val="Heading1"/>
+        <w:spacing w:before="120" w:after="40" w:line="240" w:lineRule="auto"/>
       </w:pPr>
       <w:r>
         <w:t xml:space="preserve">Entry 1 Quiet Tasks</w:t>
@@ -61,6 +63,7 @@
     <w:p>
       <w:pPr>
         <w:pStyle w:val="FirstParagraph"/>
+        <w:spacing w:before="0" w:after="60" w:line="240" w:lineRule="auto"/>
       </w:pPr>
       <w:r>
         <w:t xml:space="preserve">Oct 5, 2026 ·</w:t>
@@ -76,6 +79,7 @@
     <w:p>
       <w:pPr>
         <w:pStyle w:val="Heading2"/>
+        <w:spacing w:before="120" w:after="40" w:line="240" w:lineRule="auto"/>
       </w:pPr>
       <w:r>
         <w:t xml:space="preserve">Task 1: Fill in the form</w:t>
@@ -84,6 +88,7 @@
     <w:p>
       <w:pPr>
         <w:pStyle w:val="FirstParagraph"/>
+        <w:spacing w:before="0" w:after="60" w:line="240" w:lineRule="auto"/>
       </w:pPr>
       <w:r>
         <w:t xml:space="preserve">Write about you.</w:t>
@@ -117,6 +122,7 @@
           <w:p>
             <w:pPr>
               <w:pStyle w:val="Compact"/>
+              <w:spacing w:before="0" w:after="60" w:line="240" w:lineRule="auto"/>
               <w:jc w:val="left"/>
             </w:pPr>
             <w:r>
@@ -129,6 +135,7 @@
           <w:p>
             <w:pPr>
               <w:pStyle w:val="Compact"/>
+              <w:spacing w:before="0" w:after="60" w:line="240" w:lineRule="auto"/>
               <w:jc w:val="left"/>
             </w:pPr>
             <w:r>
@@ -143,6 +150,7 @@
           <w:p>
             <w:pPr>
               <w:pStyle w:val="Compact"/>
+              <w:spacing w:before="0" w:after="60" w:line="240" w:lineRule="auto"/>
               <w:jc w:val="left"/>
             </w:pPr>
             <w:r>
@@ -155,6 +163,7 @@
           <w:p>
             <w:pPr>
               <w:pStyle w:val="Compact"/>
+              <w:spacing w:before="0" w:after="60" w:line="240" w:lineRule="auto"/>
             </w:pPr>
           </w:p>
         </w:tc>
@@ -165,6 +174,7 @@
           <w:p>
             <w:pPr>
               <w:pStyle w:val="Compact"/>
+              <w:spacing w:before="0" w:after="60" w:line="240" w:lineRule="auto"/>
               <w:jc w:val="left"/>
             </w:pPr>
             <w:r>
@@ -177,6 +187,7 @@
           <w:p>
             <w:pPr>
               <w:pStyle w:val="Compact"/>
+              <w:spacing w:before="0" w:after="60" w:line="240" w:lineRule="auto"/>
             </w:pPr>
           </w:p>
         </w:tc>
@@ -187,6 +198,7 @@
           <w:p>
             <w:pPr>
               <w:pStyle w:val="Compact"/>
+              <w:spacing w:before="0" w:after="60" w:line="240" w:lineRule="auto"/>
               <w:jc w:val="left"/>
             </w:pPr>
             <w:r>
@@ -199,6 +211,7 @@
           <w:p>
             <w:pPr>
               <w:pStyle w:val="Compact"/>
+              <w:spacing w:before="0" w:after="60" w:line="240" w:lineRule="auto"/>
             </w:pPr>
           </w:p>
         </w:tc>
@@ -209,6 +222,7 @@
           <w:p>
             <w:pPr>
               <w:pStyle w:val="Compact"/>
+              <w:spacing w:before="0" w:after="60" w:line="240" w:lineRule="auto"/>
               <w:jc w:val="left"/>
             </w:pPr>
             <w:r>
@@ -221,6 +235,7 @@
           <w:p>
             <w:pPr>
               <w:pStyle w:val="Compact"/>
+              <w:spacing w:before="0" w:after="60" w:line="240" w:lineRule="auto"/>
             </w:pPr>
           </w:p>
         </w:tc>
@@ -231,6 +246,7 @@
           <w:p>
             <w:pPr>
               <w:pStyle w:val="Compact"/>
+              <w:spacing w:before="0" w:after="60" w:line="240" w:lineRule="auto"/>
               <w:jc w:val="left"/>
             </w:pPr>
             <w:r>
@@ -243,6 +259,7 @@
           <w:p>
             <w:pPr>
               <w:pStyle w:val="Compact"/>
+              <w:spacing w:before="0" w:after="60" w:line="240" w:lineRule="auto"/>
             </w:pPr>
           </w:p>
         </w:tc>
@@ -253,6 +270,7 @@
           <w:p>
             <w:pPr>
               <w:pStyle w:val="Compact"/>
+              <w:spacing w:before="0" w:after="60" w:line="240" w:lineRule="auto"/>
               <w:jc w:val="left"/>
             </w:pPr>
             <w:r>
@@ -265,6 +283,7 @@
           <w:p>
             <w:pPr>
               <w:pStyle w:val="Compact"/>
+              <w:spacing w:before="0" w:after="60" w:line="240" w:lineRule="auto"/>
             </w:pPr>
           </w:p>
         </w:tc>
@@ -275,6 +294,7 @@
           <w:p>
             <w:pPr>
               <w:pStyle w:val="Compact"/>
+              <w:spacing w:before="0" w:after="60" w:line="240" w:lineRule="auto"/>
               <w:jc w:val="left"/>
             </w:pPr>
             <w:r>
@@ -287,6 +307,7 @@
           <w:p>
             <w:pPr>
               <w:pStyle w:val="Compact"/>
+              <w:spacing w:before="0" w:after="60" w:line="240" w:lineRule="auto"/>
             </w:pPr>
           </w:p>
         </w:tc>
@@ -297,6 +318,7 @@
     <w:p>
       <w:pPr>
         <w:pStyle w:val="Heading2"/>
+        <w:spacing w:before="120" w:after="40" w:line="240" w:lineRule="auto"/>
       </w:pPr>
       <w:r>
         <w:t xml:space="preserve">Task 2: About me</w:t>
@@ -305,6 +327,7 @@
     <w:p>
       <w:pPr>
         <w:pStyle w:val="FirstParagraph"/>
+        <w:spacing w:before="0" w:after="60" w:line="240" w:lineRule="auto"/>
       </w:pPr>
       <w:r>
         <w:t xml:space="preserve">Finish the sentences.</w:t>
@@ -317,6 +340,7 @@
           <w:numId w:val="1001"/>
         </w:numPr>
         <w:pStyle w:val="Compact"/>
+        <w:spacing w:before="0" w:after="60" w:line="240" w:lineRule="auto"/>
       </w:pPr>
       <w:r>
         <w:t xml:space="preserve">My name is ……………………………………….</w:t>
@@ -329,6 +353,7 @@
           <w:numId w:val="1001"/>
         </w:numPr>
         <w:pStyle w:val="Compact"/>
+        <w:spacing w:before="0" w:after="60" w:line="240" w:lineRule="auto"/>
       </w:pPr>
       <w:r>
         <w:t xml:space="preserve">I am from ……………………………………….</w:t>
@@ -341,6 +366,7 @@
           <w:numId w:val="1001"/>
         </w:numPr>
         <w:pStyle w:val="Compact"/>
+        <w:spacing w:before="0" w:after="60" w:line="240" w:lineRule="auto"/>
       </w:pPr>
       <w:r>
         <w:t xml:space="preserve">I live in ……………………………………….</w:t>
@@ -353,6 +379,7 @@
           <w:numId w:val="1001"/>
         </w:numPr>
         <w:pStyle w:val="Compact"/>
+        <w:spacing w:before="0" w:after="60" w:line="240" w:lineRule="auto"/>
       </w:pPr>
       <w:r>
         <w:t xml:space="preserve">I speak ……………………………………….</w:t>
@@ -365,6 +392,7 @@
           <w:numId w:val="1001"/>
         </w:numPr>
         <w:pStyle w:val="Compact"/>
+        <w:spacing w:before="0" w:after="60" w:line="240" w:lineRule="auto"/>
       </w:pPr>
       <w:r>
         <w:t xml:space="preserve">I have ……………………………………….</w:t>
@@ -377,6 +405,7 @@
           <w:numId w:val="1001"/>
         </w:numPr>
         <w:pStyle w:val="Compact"/>
+        <w:spacing w:before="0" w:after="60" w:line="240" w:lineRule="auto"/>
       </w:pPr>
       <w:r>
         <w:t xml:space="preserve">I like ……………………………………….</w:t>
@@ -387,6 +416,7 @@
     <w:p>
       <w:pPr>
         <w:pStyle w:val="Heading2"/>
+        <w:spacing w:before="120" w:after="40" w:line="240" w:lineRule="auto"/>
       </w:pPr>
       <w:r>
         <w:t xml:space="preserve">Task 3: Read the timetable</w:t>
@@ -395,6 +425,7 @@
     <w:p>
       <w:pPr>
         <w:pStyle w:val="FirstParagraph"/>
+        <w:spacing w:before="0" w:after="60" w:line="240" w:lineRule="auto"/>
       </w:pPr>
       <w:r>
         <w:t xml:space="preserve">Read the timetable. Answer the questions.</w:t>
@@ -430,6 +461,7 @@
           <w:p>
             <w:pPr>
               <w:pStyle w:val="Compact"/>
+              <w:spacing w:before="0" w:after="60" w:line="240" w:lineRule="auto"/>
               <w:jc w:val="left"/>
             </w:pPr>
             <w:r>
@@ -442,6 +474,7 @@
           <w:p>
             <w:pPr>
               <w:pStyle w:val="Compact"/>
+              <w:spacing w:before="0" w:after="60" w:line="240" w:lineRule="auto"/>
               <w:jc w:val="left"/>
             </w:pPr>
             <w:r>
@@ -454,6 +487,7 @@
           <w:p>
             <w:pPr>
               <w:pStyle w:val="Compact"/>
+              <w:spacing w:before="0" w:after="60" w:line="240" w:lineRule="auto"/>
               <w:jc w:val="left"/>
             </w:pPr>
             <w:r>
@@ -466,6 +500,7 @@
           <w:p>
             <w:pPr>
               <w:pStyle w:val="Compact"/>
+              <w:spacing w:before="0" w:after="60" w:line="240" w:lineRule="auto"/>
               <w:jc w:val="left"/>
             </w:pPr>
             <w:r>
@@ -480,6 +515,7 @@
           <w:p>
             <w:pPr>
               <w:pStyle w:val="Compact"/>
+              <w:spacing w:before="0" w:after="60" w:line="240" w:lineRule="auto"/>
               <w:jc w:val="left"/>
             </w:pPr>
             <w:r>
@@ -492,6 +528,7 @@
           <w:p>
             <w:pPr>
               <w:pStyle w:val="Compact"/>
+              <w:spacing w:before="0" w:after="60" w:line="240" w:lineRule="auto"/>
               <w:jc w:val="left"/>
             </w:pPr>
             <w:r>
@@ -504,6 +541,7 @@
           <w:p>
             <w:pPr>
               <w:pStyle w:val="Compact"/>
+              <w:spacing w:before="0" w:after="60" w:line="240" w:lineRule="auto"/>
               <w:jc w:val="left"/>
             </w:pPr>
             <w:r>
@@ -516,6 +554,7 @@
           <w:p>
             <w:pPr>
               <w:pStyle w:val="Compact"/>
+              <w:spacing w:before="0" w:after="60" w:line="240" w:lineRule="auto"/>
               <w:jc w:val="left"/>
             </w:pPr>
             <w:r>
@@ -530,6 +569,7 @@
           <w:p>
             <w:pPr>
               <w:pStyle w:val="Compact"/>
+              <w:spacing w:before="0" w:after="60" w:line="240" w:lineRule="auto"/>
               <w:jc w:val="left"/>
             </w:pPr>
             <w:r>
@@ -542,6 +582,7 @@
           <w:p>
             <w:pPr>
               <w:pStyle w:val="Compact"/>
+              <w:spacing w:before="0" w:after="60" w:line="240" w:lineRule="auto"/>
               <w:jc w:val="left"/>
             </w:pPr>
             <w:r>
@@ -554,6 +595,7 @@
           <w:p>
             <w:pPr>
               <w:pStyle w:val="Compact"/>
+              <w:spacing w:before="0" w:after="60" w:line="240" w:lineRule="auto"/>
               <w:jc w:val="left"/>
             </w:pPr>
             <w:r>
@@ -566,6 +608,7 @@
           <w:p>
             <w:pPr>
               <w:pStyle w:val="Compact"/>
+              <w:spacing w:before="0" w:after="60" w:line="240" w:lineRule="auto"/>
               <w:jc w:val="left"/>
             </w:pPr>
             <w:r>
@@ -580,6 +623,7 @@
           <w:p>
             <w:pPr>
               <w:pStyle w:val="Compact"/>
+              <w:spacing w:before="0" w:after="60" w:line="240" w:lineRule="auto"/>
               <w:jc w:val="left"/>
             </w:pPr>
             <w:r>
@@ -592,6 +636,7 @@
           <w:p>
             <w:pPr>
               <w:pStyle w:val="Compact"/>
+              <w:spacing w:before="0" w:after="60" w:line="240" w:lineRule="auto"/>
               <w:jc w:val="left"/>
             </w:pPr>
             <w:r>
@@ -604,6 +649,7 @@
           <w:p>
             <w:pPr>
               <w:pStyle w:val="Compact"/>
+              <w:spacing w:before="0" w:after="60" w:line="240" w:lineRule="auto"/>
               <w:jc w:val="left"/>
             </w:pPr>
             <w:r>
@@ -616,6 +662,7 @@
           <w:p>
             <w:pPr>
               <w:pStyle w:val="Compact"/>
+              <w:spacing w:before="0" w:after="60" w:line="240" w:lineRule="auto"/>
               <w:jc w:val="left"/>
             </w:pPr>
             <w:r>
@@ -630,6 +677,7 @@
           <w:p>
             <w:pPr>
               <w:pStyle w:val="Compact"/>
+              <w:spacing w:before="0" w:after="60" w:line="240" w:lineRule="auto"/>
               <w:jc w:val="left"/>
             </w:pPr>
             <w:r>
@@ -642,6 +690,7 @@
           <w:p>
             <w:pPr>
               <w:pStyle w:val="Compact"/>
+              <w:spacing w:before="0" w:after="60" w:line="240" w:lineRule="auto"/>
               <w:jc w:val="left"/>
             </w:pPr>
             <w:r>
@@ -654,6 +703,7 @@
           <w:p>
             <w:pPr>
               <w:pStyle w:val="Compact"/>
+              <w:spacing w:before="0" w:after="60" w:line="240" w:lineRule="auto"/>
               <w:jc w:val="left"/>
             </w:pPr>
             <w:r>
@@ -666,6 +716,7 @@
           <w:p>
             <w:pPr>
               <w:pStyle w:val="Compact"/>
+              <w:spacing w:before="0" w:after="60" w:line="240" w:lineRule="auto"/>
               <w:jc w:val="left"/>
             </w:pPr>
             <w:r>
@@ -680,6 +731,7 @@
           <w:p>
             <w:pPr>
               <w:pStyle w:val="Compact"/>
+              <w:spacing w:before="0" w:after="60" w:line="240" w:lineRule="auto"/>
               <w:jc w:val="left"/>
             </w:pPr>
             <w:r>
@@ -692,6 +744,7 @@
           <w:p>
             <w:pPr>
               <w:pStyle w:val="Compact"/>
+              <w:spacing w:before="0" w:after="60" w:line="240" w:lineRule="auto"/>
               <w:jc w:val="left"/>
             </w:pPr>
             <w:r>
@@ -704,6 +757,7 @@
           <w:p>
             <w:pPr>
               <w:pStyle w:val="Compact"/>
+              <w:spacing w:before="0" w:after="60" w:line="240" w:lineRule="auto"/>
               <w:jc w:val="left"/>
             </w:pPr>
             <w:r>
@@ -716,6 +770,7 @@
           <w:p>
             <w:pPr>
               <w:pStyle w:val="Compact"/>
+              <w:spacing w:before="0" w:after="60" w:line="240" w:lineRule="auto"/>
               <w:jc w:val="left"/>
             </w:pPr>
             <w:r>
@@ -732,6 +787,7 @@
           <w:numId w:val="1002"/>
         </w:numPr>
         <w:pStyle w:val="Compact"/>
+        <w:spacing w:before="0" w:after="60" w:line="240" w:lineRule="auto"/>
       </w:pPr>
       <w:r>
         <w:t xml:space="preserve">What day is the Music class? …………………………</w:t>
@@ -744,6 +800,7 @@
           <w:numId w:val="1002"/>
         </w:numPr>
         <w:pStyle w:val="Compact"/>
+        <w:spacing w:before="0" w:after="60" w:line="240" w:lineRule="auto"/>
       </w:pPr>
       <w:r>
         <w:t xml:space="preserve">What time is the Maths class? …………………………</w:t>
@@ -756,6 +813,7 @@
           <w:numId w:val="1002"/>
         </w:numPr>
         <w:pStyle w:val="Compact"/>
+        <w:spacing w:before="0" w:after="60" w:line="240" w:lineRule="auto"/>
       </w:pPr>
       <w:r>
         <w:t xml:space="preserve">Which room is the Yoga class in? …………………………</w:t>
@@ -768,6 +826,7 @@
           <w:numId w:val="1002"/>
         </w:numPr>
         <w:pStyle w:val="Compact"/>
+        <w:spacing w:before="0" w:after="60" w:line="240" w:lineRule="auto"/>
       </w:pPr>
       <w:r>
         <w:t xml:space="preserve">Which class is on Monday? …………………………</w:t>
@@ -780,6 +839,7 @@
           <w:numId w:val="1002"/>
         </w:numPr>
         <w:pStyle w:val="Compact"/>
+        <w:spacing w:before="0" w:after="60" w:line="240" w:lineRule="auto"/>
       </w:pPr>
       <w:r>
         <w:t xml:space="preserve">Which class is in Room 3? …………………………</w:t>
@@ -792,6 +852,7 @@
           <w:numId w:val="1002"/>
         </w:numPr>
         <w:pStyle w:val="Compact"/>
+        <w:spacing w:before="0" w:after="60" w:line="240" w:lineRule="auto"/>
       </w:pPr>
       <w:r>
         <w:t xml:space="preserve">What time is the English class? …………………………</w:t>
@@ -802,6 +863,8 @@
     <w:p>
       <w:pPr>
         <w:pStyle w:val="Heading2"/>
+        <w:keepNext/>
+        <w:spacing w:before="120" w:after="40" w:line="240" w:lineRule="auto"/>
       </w:pPr>
       <w:r>
         <w:t xml:space="preserve">Task 4: A to Z</w:t>
@@ -810,6 +873,8 @@
     <w:p>
       <w:pPr>
         <w:pStyle w:val="FirstParagraph"/>
+        <w:keepNext/>
+        <w:spacing w:before="0" w:after="60" w:line="240" w:lineRule="auto"/>
       </w:pPr>
       <w:r>
         <w:t xml:space="preserve">Write the words in alphabetical order (A, B, C …).</w:t>
@@ -818,6 +883,8 @@
     <w:p>
       <w:pPr>
         <w:pStyle w:val="BodyText"/>
+        <w:keepNext/>
+        <w:spacing w:before="0" w:after="60" w:line="240" w:lineRule="auto"/>
       </w:pPr>
       <w:r>
         <w:rPr>
@@ -829,11 +896,13 @@
     </w:p>
     <w:p>
       <w:pPr>
+        <w:keepNext/>
         <w:numPr>
           <w:ilvl w:val="0"/>
           <w:numId w:val="1003"/>
         </w:numPr>
         <w:pStyle w:val="Compact"/>
+        <w:spacing w:before="0" w:after="60" w:line="240" w:lineRule="auto"/>
       </w:pPr>
       <w:r>
         <w:t xml:space="preserve">…………………………</w:t>
@@ -841,11 +910,13 @@
     </w:p>
     <w:p>
       <w:pPr>
+        <w:keepNext/>
         <w:numPr>
           <w:ilvl w:val="0"/>
           <w:numId w:val="1003"/>
         </w:numPr>
         <w:pStyle w:val="Compact"/>
+        <w:spacing w:before="0" w:after="60" w:line="240" w:lineRule="auto"/>
       </w:pPr>
       <w:r>
         <w:t xml:space="preserve">…………………………</w:t>
@@ -853,11 +924,13 @@
     </w:p>
     <w:p>
       <w:pPr>
+        <w:keepNext/>
         <w:numPr>
           <w:ilvl w:val="0"/>
           <w:numId w:val="1003"/>
         </w:numPr>
         <w:pStyle w:val="Compact"/>
+        <w:spacing w:before="0" w:after="60" w:line="240" w:lineRule="auto"/>
       </w:pPr>
       <w:r>
         <w:t xml:space="preserve">…………………………</w:t>
@@ -865,11 +938,13 @@
     </w:p>
     <w:p>
       <w:pPr>
+        <w:keepNext/>
         <w:numPr>
           <w:ilvl w:val="0"/>
           <w:numId w:val="1003"/>
         </w:numPr>
         <w:pStyle w:val="Compact"/>
+        <w:spacing w:before="0" w:after="60" w:line="240" w:lineRule="auto"/>
       </w:pPr>
       <w:r>
         <w:t xml:space="preserve">…………………………</w:t>
@@ -877,11 +952,13 @@
     </w:p>
     <w:p>
       <w:pPr>
+        <w:keepNext/>
         <w:numPr>
           <w:ilvl w:val="0"/>
           <w:numId w:val="1003"/>
         </w:numPr>
         <w:pStyle w:val="Compact"/>
+        <w:spacing w:before="0" w:after="60" w:line="240" w:lineRule="auto"/>
       </w:pPr>
       <w:r>
         <w:t xml:space="preserve">…………………………</w:t>
@@ -889,11 +966,13 @@
     </w:p>
     <w:p>
       <w:pPr>
+        <w:keepNext/>
         <w:numPr>
           <w:ilvl w:val="0"/>
           <w:numId w:val="1003"/>
         </w:numPr>
         <w:pStyle w:val="Compact"/>
+        <w:spacing w:before="0" w:after="60" w:line="240" w:lineRule="auto"/>
       </w:pPr>
       <w:r>
         <w:t xml:space="preserve">…………………………</w:t>
@@ -901,11 +980,13 @@
     </w:p>
     <w:p>
       <w:pPr>
+        <w:keepNext/>
         <w:numPr>
           <w:ilvl w:val="0"/>
           <w:numId w:val="1003"/>
         </w:numPr>
         <w:pStyle w:val="Compact"/>
+        <w:spacing w:before="0" w:after="60" w:line="240" w:lineRule="auto"/>
       </w:pPr>
       <w:r>
         <w:t xml:space="preserve">…………………………</w:t>
@@ -913,11 +994,13 @@
     </w:p>
     <w:p>
       <w:pPr>
+        <w:keepNext/>
         <w:numPr>
           <w:ilvl w:val="0"/>
           <w:numId w:val="1003"/>
         </w:numPr>
         <w:pStyle w:val="Compact"/>
+        <w:spacing w:before="0" w:after="60" w:line="240" w:lineRule="auto"/>
       </w:pPr>
       <w:r>
         <w:t xml:space="preserve">…………………………</w:t>
@@ -928,6 +1011,7 @@
     <w:p>
       <w:pPr>
         <w:pStyle w:val="Heading2"/>
+        <w:spacing w:before="120" w:after="40" w:line="240" w:lineRule="auto"/>
       </w:pPr>
       <w:r>
         <w:t xml:space="preserve">Task 5: Last weekend</w:t>
@@ -936,6 +1020,7 @@
     <w:p>
       <w:pPr>
         <w:pStyle w:val="FirstParagraph"/>
+        <w:spacing w:before="0" w:after="60" w:line="240" w:lineRule="auto"/>
       </w:pPr>
       <w:r>
         <w:t xml:space="preserve">What did you do last weekend? Tick the boxes.</w:t>
@@ -948,6 +1033,7 @@
           <w:numId w:val="1004"/>
         </w:numPr>
         <w:pStyle w:val="Compact"/>
+        <w:spacing w:before="0" w:after="60" w:line="240" w:lineRule="auto"/>
       </w:pPr>
       <w:r>
         <w:t xml:space="preserve">☐ I went shopping.</w:t>
@@ -960,6 +1046,7 @@
           <w:numId w:val="1004"/>
         </w:numPr>
         <w:pStyle w:val="Compact"/>
+        <w:spacing w:before="0" w:after="60" w:line="240" w:lineRule="auto"/>
       </w:pPr>
       <w:r>
         <w:t xml:space="preserve">☐ I cooked dinner.</w:t>
@@ -972,6 +1059,7 @@
           <w:numId w:val="1004"/>
         </w:numPr>
         <w:pStyle w:val="Compact"/>
+        <w:spacing w:before="0" w:after="60" w:line="240" w:lineRule="auto"/>
       </w:pPr>
       <w:r>
         <w:t xml:space="preserve">☐ I visited my family.</w:t>
@@ -984,6 +1072,7 @@
           <w:numId w:val="1004"/>
         </w:numPr>
         <w:pStyle w:val="Compact"/>
+        <w:spacing w:before="0" w:after="60" w:line="240" w:lineRule="auto"/>
       </w:pPr>
       <w:r>
         <w:t xml:space="preserve">☐ I cleaned the house.</w:t>
@@ -996,6 +1085,7 @@
           <w:numId w:val="1004"/>
         </w:numPr>
         <w:pStyle w:val="Compact"/>
+        <w:spacing w:before="0" w:after="60" w:line="240" w:lineRule="auto"/>
       </w:pPr>
       <w:r>
         <w:t xml:space="preserve">☐ I watched TV.</w:t>
@@ -1008,6 +1098,7 @@
           <w:numId w:val="1004"/>
         </w:numPr>
         <w:pStyle w:val="Compact"/>
+        <w:spacing w:before="0" w:after="60" w:line="240" w:lineRule="auto"/>
       </w:pPr>
       <w:r>
         <w:t xml:space="preserve">☐ I went to the park.</w:t>
@@ -1020,6 +1111,7 @@
           <w:numId w:val="1004"/>
         </w:numPr>
         <w:pStyle w:val="Compact"/>
+        <w:spacing w:before="0" w:after="60" w:line="240" w:lineRule="auto"/>
       </w:pPr>
       <w:r>
         <w:t xml:space="preserve">☐ I worked.</w:t>
@@ -1032,6 +1124,7 @@
           <w:numId w:val="1004"/>
         </w:numPr>
         <w:pStyle w:val="Compact"/>
+        <w:spacing w:before="0" w:after="60" w:line="240" w:lineRule="auto"/>
       </w:pPr>
       <w:r>
         <w:t xml:space="preserve">☐ I played with my children.</w:t>
@@ -1040,6 +1133,7 @@
     <w:p>
       <w:pPr>
         <w:pStyle w:val="FirstParagraph"/>
+        <w:spacing w:before="0" w:after="60" w:line="240" w:lineRule="auto"/>
       </w:pPr>
       <w:r>
         <w:t xml:space="preserve">Now write three sentences about your weekend.</w:t>
@@ -1052,6 +1146,7 @@
           <w:numId w:val="1005"/>
         </w:numPr>
         <w:pStyle w:val="Compact"/>
+        <w:spacing w:before="0" w:after="60" w:line="240" w:lineRule="auto"/>
       </w:pPr>
       <w:r>
         <w:t xml:space="preserve">Last weekend I ……………………………………….</w:t>
@@ -1064,6 +1159,7 @@
           <w:numId w:val="1005"/>
         </w:numPr>
         <w:pStyle w:val="Compact"/>
+        <w:spacing w:before="0" w:after="60" w:line="240" w:lineRule="auto"/>
       </w:pPr>
       <w:r>
         <w:t xml:space="preserve">I ……………………………………….</w:t>
@@ -1076,6 +1172,7 @@
           <w:numId w:val="1005"/>
         </w:numPr>
         <w:pStyle w:val="Compact"/>
+        <w:spacing w:before="0" w:after="60" w:line="240" w:lineRule="auto"/>
       </w:pPr>
       <w:r>
         <w:t xml:space="preserve">I ……………………………………….</w:t>
@@ -1086,6 +1183,7 @@
     <w:p>
       <w:pPr>
         <w:pStyle w:val="Heading2"/>
+        <w:spacing w:before="120" w:after="40" w:line="240" w:lineRule="auto"/>
       </w:pPr>
       <w:r>
         <w:t xml:space="preserve">Task 6: My day</w:t>
@@ -1094,6 +1192,7 @@
     <w:p>
       <w:pPr>
         <w:pStyle w:val="FirstParagraph"/>
+        <w:spacing w:before="0" w:after="60" w:line="240" w:lineRule="auto"/>
       </w:pPr>
       <w:r>
         <w:t xml:space="preserve">Match the words. Draw a line.</w:t>
@@ -1127,6 +1226,7 @@
           <w:p>
             <w:pPr>
               <w:pStyle w:val="Compact"/>
+              <w:spacing w:before="0" w:after="60" w:line="240" w:lineRule="auto"/>
               <w:jc w:val="left"/>
             </w:pPr>
             <w:r>
@@ -1139,6 +1239,7 @@
           <w:p>
             <w:pPr>
               <w:pStyle w:val="Compact"/>
+              <w:spacing w:before="0" w:after="60" w:line="240" w:lineRule="auto"/>
               <w:jc w:val="left"/>
             </w:pPr>
             <w:r>
@@ -1153,6 +1254,7 @@
           <w:p>
             <w:pPr>
               <w:pStyle w:val="Compact"/>
+              <w:spacing w:before="0" w:after="60" w:line="240" w:lineRule="auto"/>
               <w:jc w:val="left"/>
             </w:pPr>
             <w:r>
@@ -1165,6 +1267,7 @@
           <w:p>
             <w:pPr>
               <w:pStyle w:val="Compact"/>
+              <w:spacing w:before="0" w:after="60" w:line="240" w:lineRule="auto"/>
               <w:jc w:val="left"/>
             </w:pPr>
             <w:r>
@@ -1179,6 +1282,7 @@
           <w:p>
             <w:pPr>
               <w:pStyle w:val="Compact"/>
+              <w:spacing w:before="0" w:after="60" w:line="240" w:lineRule="auto"/>
               <w:jc w:val="left"/>
             </w:pPr>
             <w:r>
@@ -1191,6 +1295,7 @@
           <w:p>
             <w:pPr>
               <w:pStyle w:val="Compact"/>
+              <w:spacing w:before="0" w:after="60" w:line="240" w:lineRule="auto"/>
               <w:jc w:val="left"/>
             </w:pPr>
             <w:r>
@@ -1205,6 +1310,7 @@
           <w:p>
             <w:pPr>
               <w:pStyle w:val="Compact"/>
+              <w:spacing w:before="0" w:after="60" w:line="240" w:lineRule="auto"/>
               <w:jc w:val="left"/>
             </w:pPr>
             <w:r>
@@ -1217,6 +1323,7 @@
           <w:p>
             <w:pPr>
               <w:pStyle w:val="Compact"/>
+              <w:spacing w:before="0" w:after="60" w:line="240" w:lineRule="auto"/>
               <w:jc w:val="left"/>
             </w:pPr>
             <w:r>
@@ -1231,6 +1338,7 @@
           <w:p>
             <w:pPr>
               <w:pStyle w:val="Compact"/>
+              <w:spacing w:before="0" w:after="60" w:line="240" w:lineRule="auto"/>
               <w:jc w:val="left"/>
             </w:pPr>
             <w:r>
@@ -1243,6 +1351,7 @@
           <w:p>
             <w:pPr>
               <w:pStyle w:val="Compact"/>
+              <w:spacing w:before="0" w:after="60" w:line="240" w:lineRule="auto"/>
               <w:jc w:val="left"/>
             </w:pPr>
             <w:r>
@@ -1257,6 +1366,7 @@
           <w:p>
             <w:pPr>
               <w:pStyle w:val="Compact"/>
+              <w:spacing w:before="0" w:after="60" w:line="240" w:lineRule="auto"/>
               <w:jc w:val="left"/>
             </w:pPr>
             <w:r>
@@ -1269,6 +1379,7 @@
           <w:p>
             <w:pPr>
               <w:pStyle w:val="Compact"/>
+              <w:spacing w:before="0" w:after="60" w:line="240" w:lineRule="auto"/>
               <w:jc w:val="left"/>
             </w:pPr>
             <w:r>
@@ -1283,6 +1394,7 @@
           <w:p>
             <w:pPr>
               <w:pStyle w:val="Compact"/>
+              <w:spacing w:before="0" w:after="60" w:line="240" w:lineRule="auto"/>
               <w:jc w:val="left"/>
             </w:pPr>
             <w:r>
@@ -1295,6 +1407,7 @@
           <w:p>
             <w:pPr>
               <w:pStyle w:val="Compact"/>
+              <w:spacing w:before="0" w:after="60" w:line="240" w:lineRule="auto"/>
               <w:jc w:val="left"/>
             </w:pPr>
             <w:r>
@@ -1307,6 +1420,7 @@
     <w:p>
       <w:pPr>
         <w:pStyle w:val="BodyText"/>
+        <w:spacing w:before="0" w:after="60" w:line="240" w:lineRule="auto"/>
       </w:pPr>
       <w:r>
         <w:t xml:space="preserve">Finished? Write about your day.</w:t>
@@ -1319,6 +1433,7 @@
           <w:numId w:val="1006"/>
         </w:numPr>
         <w:pStyle w:val="Compact"/>
+        <w:spacing w:before="0" w:after="60" w:line="240" w:lineRule="auto"/>
       </w:pPr>
       <w:r>
         <w:t xml:space="preserve">I get up at …………………………</w:t>
@@ -1331,6 +1446,7 @@
           <w:numId w:val="1006"/>
         </w:numPr>
         <w:pStyle w:val="Compact"/>
+        <w:spacing w:before="0" w:after="60" w:line="240" w:lineRule="auto"/>
       </w:pPr>
       <w:r>
         <w:t xml:space="preserve">I have breakfast at …………………………</w:t>
@@ -1343,6 +1459,7 @@
           <w:numId w:val="1006"/>
         </w:numPr>
         <w:pStyle w:val="Compact"/>
+        <w:spacing w:before="0" w:after="60" w:line="240" w:lineRule="auto"/>
       </w:pPr>
       <w:r>
         <w:t xml:space="preserve">I go to college at …………………………</w:t>
@@ -1355,6 +1472,7 @@
           <w:numId w:val="1006"/>
         </w:numPr>
         <w:pStyle w:val="Compact"/>
+        <w:spacing w:before="0" w:after="60" w:line="240" w:lineRule="auto"/>
       </w:pPr>
       <w:r>
         <w:t xml:space="preserve">I cook dinner at …………………………</w:t>
@@ -1367,6 +1485,7 @@
           <w:numId w:val="1006"/>
         </w:numPr>
         <w:pStyle w:val="Compact"/>
+        <w:spacing w:before="0" w:after="60" w:line="240" w:lineRule="auto"/>
       </w:pPr>
       <w:r>
         <w:t xml:space="preserve">I go to bed at …………………………</w:t>
@@ -1377,6 +1496,7 @@
     <w:p>
       <w:pPr>
         <w:pStyle w:val="Heading2"/>
+        <w:spacing w:before="120" w:after="40" w:line="240" w:lineRule="auto"/>
       </w:pPr>
       <w:r>
         <w:t xml:space="preserve">Task 7: Read about Maria</w:t>
@@ -1385,6 +1505,7 @@
     <w:p>
       <w:pPr>
         <w:pStyle w:val="FirstParagraph"/>
+        <w:spacing w:before="0" w:after="60" w:line="240" w:lineRule="auto"/>
       </w:pPr>
       <w:r>
         <w:t xml:space="preserve">Tasks 7 to 10 are harder. Do them if you finish early.</w:t>
@@ -1393,6 +1514,7 @@
     <w:p>
       <w:pPr>
         <w:pStyle w:val="BodyText"/>
+        <w:spacing w:before="0" w:after="60" w:line="240" w:lineRule="auto"/>
       </w:pPr>
       <w:r>
         <w:t xml:space="preserve">Read the text. Answer the questions.</w:t>
@@ -1401,6 +1523,7 @@
     <w:p>
       <w:pPr>
         <w:pStyle w:val="BodyText"/>
+        <w:spacing w:before="0" w:after="60" w:line="240" w:lineRule="auto"/>
       </w:pPr>
       <w:r>
         <w:t xml:space="preserve">Maria is from Brazil. She lives in Hackney with her husband and two children. She came to London three years ago. Every morning she takes her children to school and then she goes to college. She studies English on Monday and Wednesday. On Saturday she works in a café. Last weekend she did not work. She went to the park with her family and they had a picnic. Next year she wants to study to be a nurse because she likes helping people.</w:t>
@@ -1413,6 +1536,7 @@
           <w:numId w:val="1007"/>
         </w:numPr>
         <w:pStyle w:val="Compact"/>
+        <w:spacing w:before="0" w:after="60" w:line="240" w:lineRule="auto"/>
       </w:pPr>
       <w:r>
         <w:t xml:space="preserve">Where is Maria from? …………………………</w:t>
@@ -1425,6 +1549,7 @@
           <w:numId w:val="1007"/>
         </w:numPr>
         <w:pStyle w:val="Compact"/>
+        <w:spacing w:before="0" w:after="60" w:line="240" w:lineRule="auto"/>
       </w:pPr>
       <w:r>
         <w:t xml:space="preserve">How many children does she have? …………………………</w:t>
@@ -1437,6 +1562,7 @@
           <w:numId w:val="1007"/>
         </w:numPr>
         <w:pStyle w:val="Compact"/>
+        <w:spacing w:before="0" w:after="60" w:line="240" w:lineRule="auto"/>
       </w:pPr>
       <w:r>
         <w:t xml:space="preserve">When did she come to London? …………………………</w:t>
@@ -1449,6 +1575,7 @@
           <w:numId w:val="1007"/>
         </w:numPr>
         <w:pStyle w:val="Compact"/>
+        <w:spacing w:before="0" w:after="60" w:line="240" w:lineRule="auto"/>
       </w:pPr>
       <w:r>
         <w:t xml:space="preserve">Which days does she study English? …………………………</w:t>
@@ -1461,6 +1588,7 @@
           <w:numId w:val="1007"/>
         </w:numPr>
         <w:pStyle w:val="Compact"/>
+        <w:spacing w:before="0" w:after="60" w:line="240" w:lineRule="auto"/>
       </w:pPr>
       <w:r>
         <w:t xml:space="preserve">Where does she work on Saturday? …………………………</w:t>
@@ -1473,6 +1601,7 @@
           <w:numId w:val="1007"/>
         </w:numPr>
         <w:pStyle w:val="Compact"/>
+        <w:spacing w:before="0" w:after="60" w:line="240" w:lineRule="auto"/>
       </w:pPr>
       <w:r>
         <w:t xml:space="preserve">What did she do last weekend? …………………………</w:t>
@@ -1485,6 +1614,7 @@
           <w:numId w:val="1007"/>
         </w:numPr>
         <w:pStyle w:val="Compact"/>
+        <w:spacing w:before="0" w:after="60" w:line="240" w:lineRule="auto"/>
       </w:pPr>
       <w:r>
         <w:t xml:space="preserve">Why does she want to be a nurse? …………………………</w:t>
@@ -1497,6 +1627,7 @@
           <w:numId w:val="1007"/>
         </w:numPr>
         <w:pStyle w:val="Compact"/>
+        <w:spacing w:before="0" w:after="60" w:line="240" w:lineRule="auto"/>
       </w:pPr>
       <w:r>
         <w:t xml:space="preserve">Maria works every day. True or false? …………………………</w:t>
@@ -1507,6 +1638,7 @@
     <w:p>
       <w:pPr>
         <w:pStyle w:val="Heading2"/>
+        <w:spacing w:before="120" w:after="40" w:line="240" w:lineRule="auto"/>
       </w:pPr>
       <w:r>
         <w:t xml:space="preserve">Task 8: Fix the sentences</w:t>
@@ -1515,6 +1647,7 @@
     <w:p>
       <w:pPr>
         <w:pStyle w:val="FirstParagraph"/>
+        <w:spacing w:before="0" w:after="60" w:line="240" w:lineRule="auto"/>
       </w:pPr>
       <w:r>
         <w:t xml:space="preserve">Each sentence has a mistake. Write the sentence correctly.</w:t>
@@ -1526,6 +1659,7 @@
           <w:ilvl w:val="0"/>
           <w:numId w:val="1008"/>
         </w:numPr>
+        <w:spacing w:before="0" w:after="60" w:line="240" w:lineRule="auto"/>
       </w:pPr>
       <w:r>
         <w:t xml:space="preserve">i am from turkey.</w:t>
@@ -1537,6 +1671,7 @@
           <w:ilvl w:val="0"/>
           <w:numId w:val="1000"/>
         </w:numPr>
+        <w:spacing w:before="0" w:after="60" w:line="240" w:lineRule="auto"/>
       </w:pPr>
       <w:r>
         <w:t xml:space="preserve">……………………………………….</w:t>
@@ -1548,6 +1683,7 @@
           <w:ilvl w:val="0"/>
           <w:numId w:val="1008"/>
         </w:numPr>
+        <w:spacing w:before="0" w:after="60" w:line="240" w:lineRule="auto"/>
       </w:pPr>
       <w:r>
         <w:t xml:space="preserve">She go to college on Monday.</w:t>
@@ -1559,6 +1695,7 @@
           <w:ilvl w:val="0"/>
           <w:numId w:val="1000"/>
         </w:numPr>
+        <w:spacing w:before="0" w:after="60" w:line="240" w:lineRule="auto"/>
       </w:pPr>
       <w:r>
         <w:t xml:space="preserve">……………………………………….</w:t>
@@ -1570,6 +1707,7 @@
           <w:ilvl w:val="0"/>
           <w:numId w:val="1008"/>
         </w:numPr>
+        <w:spacing w:before="0" w:after="60" w:line="240" w:lineRule="auto"/>
       </w:pPr>
       <w:r>
         <w:t xml:space="preserve">Yesterday I go to the shop.</w:t>
@@ -1581,6 +1719,7 @@
           <w:ilvl w:val="0"/>
           <w:numId w:val="1000"/>
         </w:numPr>
+        <w:spacing w:before="0" w:after="60" w:line="240" w:lineRule="auto"/>
       </w:pPr>
       <w:r>
         <w:t xml:space="preserve">……………………………………….</w:t>
@@ -1592,6 +1731,7 @@
           <w:ilvl w:val="0"/>
           <w:numId w:val="1008"/>
         </w:numPr>
+        <w:spacing w:before="0" w:after="60" w:line="240" w:lineRule="auto"/>
       </w:pPr>
       <w:r>
         <w:t xml:space="preserve">He have two children.</w:t>
@@ -1603,6 +1743,7 @@
           <w:ilvl w:val="0"/>
           <w:numId w:val="1000"/>
         </w:numPr>
+        <w:spacing w:before="0" w:after="60" w:line="240" w:lineRule="auto"/>
       </w:pPr>
       <w:r>
         <w:t xml:space="preserve">……………………………………….</w:t>
@@ -1614,6 +1755,7 @@
           <w:ilvl w:val="0"/>
           <w:numId w:val="1008"/>
         </w:numPr>
+        <w:spacing w:before="0" w:after="60" w:line="240" w:lineRule="auto"/>
       </w:pPr>
       <w:r>
         <w:t xml:space="preserve">I am live in London.</w:t>
@@ -1625,6 +1767,7 @@
           <w:ilvl w:val="0"/>
           <w:numId w:val="1000"/>
         </w:numPr>
+        <w:spacing w:before="0" w:after="60" w:line="240" w:lineRule="auto"/>
       </w:pPr>
       <w:r>
         <w:t xml:space="preserve">……………………………………….</w:t>
@@ -1636,6 +1779,7 @@
           <w:ilvl w:val="0"/>
           <w:numId w:val="1008"/>
         </w:numPr>
+        <w:spacing w:before="0" w:after="60" w:line="240" w:lineRule="auto"/>
       </w:pPr>
       <w:r>
         <w:t xml:space="preserve">we cooked dinner last night</w:t>
@@ -1647,6 +1791,7 @@
           <w:ilvl w:val="0"/>
           <w:numId w:val="1000"/>
         </w:numPr>
+        <w:spacing w:before="0" w:after="60" w:line="240" w:lineRule="auto"/>
       </w:pPr>
       <w:r>
         <w:t xml:space="preserve">……………………………………….</w:t>
@@ -1657,6 +1802,7 @@
     <w:p>
       <w:pPr>
         <w:pStyle w:val="Heading2"/>
+        <w:spacing w:before="120" w:after="40" w:line="240" w:lineRule="auto"/>
       </w:pPr>
       <w:r>
         <w:t xml:space="preserve">Task 9: A to Z, harder</w:t>
@@ -1665,6 +1811,7 @@
     <w:p>
       <w:pPr>
         <w:pStyle w:val="FirstParagraph"/>
+        <w:spacing w:before="0" w:after="60" w:line="240" w:lineRule="auto"/>
       </w:pPr>
       <w:r>
         <w:t xml:space="preserve">All the words start with S. Look at the second letter. Write the words in alphabetical order.</w:t>
@@ -1673,6 +1820,7 @@
     <w:p>
       <w:pPr>
         <w:pStyle w:val="BodyText"/>
+        <w:spacing w:before="0" w:after="60" w:line="240" w:lineRule="auto"/>
       </w:pPr>
       <w:r>
         <w:rPr>
@@ -1689,6 +1837,7 @@
           <w:numId w:val="1009"/>
         </w:numPr>
         <w:pStyle w:val="Compact"/>
+        <w:spacing w:before="0" w:after="60" w:line="240" w:lineRule="auto"/>
       </w:pPr>
       <w:r>
         <w:t xml:space="preserve">…………………………</w:t>
@@ -1701,6 +1850,7 @@
           <w:numId w:val="1009"/>
         </w:numPr>
         <w:pStyle w:val="Compact"/>
+        <w:spacing w:before="0" w:after="60" w:line="240" w:lineRule="auto"/>
       </w:pPr>
       <w:r>
         <w:t xml:space="preserve">…………………………</w:t>
@@ -1713,6 +1863,7 @@
           <w:numId w:val="1009"/>
         </w:numPr>
         <w:pStyle w:val="Compact"/>
+        <w:spacing w:before="0" w:after="60" w:line="240" w:lineRule="auto"/>
       </w:pPr>
       <w:r>
         <w:t xml:space="preserve">…………………………</w:t>
@@ -1725,6 +1876,7 @@
           <w:numId w:val="1009"/>
         </w:numPr>
         <w:pStyle w:val="Compact"/>
+        <w:spacing w:before="0" w:after="60" w:line="240" w:lineRule="auto"/>
       </w:pPr>
       <w:r>
         <w:t xml:space="preserve">…………………………</w:t>
@@ -1737,6 +1889,7 @@
           <w:numId w:val="1009"/>
         </w:numPr>
         <w:pStyle w:val="Compact"/>
+        <w:spacing w:before="0" w:after="60" w:line="240" w:lineRule="auto"/>
       </w:pPr>
       <w:r>
         <w:t xml:space="preserve">…………………………</w:t>
@@ -1749,6 +1902,7 @@
           <w:numId w:val="1009"/>
         </w:numPr>
         <w:pStyle w:val="Compact"/>
+        <w:spacing w:before="0" w:after="60" w:line="240" w:lineRule="auto"/>
       </w:pPr>
       <w:r>
         <w:t xml:space="preserve">…………………………</w:t>
@@ -1759,6 +1913,7 @@
     <w:p>
       <w:pPr>
         <w:pStyle w:val="Heading2"/>
+        <w:spacing w:before="120" w:after="40" w:line="240" w:lineRule="auto"/>
       </w:pPr>
       <w:r>
         <w:t xml:space="preserve">Task 10: Write about you</w:t>
@@ -1767,6 +1922,7 @@
     <w:p>
       <w:pPr>
         <w:pStyle w:val="FirstParagraph"/>
+        <w:spacing w:before="0" w:after="60" w:line="240" w:lineRule="auto"/>
       </w:pPr>
       <w:r>
         <w:t xml:space="preserve">Write 8 to 10 sentences. Use the questions to help you. Use</w:t>
@@ -1795,6 +1951,7 @@
           <w:numId w:val="1010"/>
         </w:numPr>
         <w:pStyle w:val="Compact"/>
+        <w:spacing w:before="0" w:after="60" w:line="240" w:lineRule="auto"/>
       </w:pPr>
       <w:r>
         <w:t xml:space="preserve">Where do you live? Who do you live with?</w:t>
@@ -1807,6 +1964,7 @@
           <w:numId w:val="1010"/>
         </w:numPr>
         <w:pStyle w:val="Compact"/>
+        <w:spacing w:before="0" w:after="60" w:line="240" w:lineRule="auto"/>
       </w:pPr>
       <w:r>
         <w:t xml:space="preserve">What do you do every day?</w:t>
@@ -1819,6 +1977,7 @@
           <w:numId w:val="1010"/>
         </w:numPr>
         <w:pStyle w:val="Compact"/>
+        <w:spacing w:before="0" w:after="60" w:line="240" w:lineRule="auto"/>
       </w:pPr>
       <w:r>
         <w:t xml:space="preserve">What did you do last weekend? Who did you go with?</w:t>
@@ -1831,6 +1990,7 @@
           <w:numId w:val="1010"/>
         </w:numPr>
         <w:pStyle w:val="Compact"/>
+        <w:spacing w:before="0" w:after="60" w:line="240" w:lineRule="auto"/>
       </w:pPr>
       <w:r>
         <w:t xml:space="preserve">Did you like it? Why?</w:t>
@@ -1843,6 +2003,7 @@
           <w:numId w:val="1010"/>
         </w:numPr>
         <w:pStyle w:val="Compact"/>
+        <w:spacing w:before="0" w:after="60" w:line="240" w:lineRule="auto"/>
       </w:pPr>
       <w:r>
         <w:t xml:space="preserve">What do you want to do next year? Why?</w:t>
@@ -1851,6 +2012,7 @@
     <w:p>
       <w:pPr>
         <w:pStyle w:val="FirstParagraph"/>
+        <w:spacing w:before="0" w:after="60" w:line="240" w:lineRule="auto"/>
       </w:pPr>
       <w:r>
         <w:t xml:space="preserve">………………………………………………………………………………</w:t>
@@ -1859,6 +2021,7 @@
     <w:p>
       <w:pPr>
         <w:pStyle w:val="BodyText"/>
+        <w:spacing w:before="0" w:after="60" w:line="240" w:lineRule="auto"/>
       </w:pPr>
       <w:r>
         <w:t xml:space="preserve">………………………………………………………………………………</w:t>
@@ -1867,6 +2030,7 @@
     <w:p>
       <w:pPr>
         <w:pStyle w:val="BodyText"/>
+        <w:spacing w:before="0" w:after="60" w:line="240" w:lineRule="auto"/>
       </w:pPr>
       <w:r>
         <w:t xml:space="preserve">………………………………………………………………………………</w:t>
@@ -1875,6 +2039,7 @@
     <w:p>
       <w:pPr>
         <w:pStyle w:val="BodyText"/>
+        <w:spacing w:before="0" w:after="60" w:line="240" w:lineRule="auto"/>
       </w:pPr>
       <w:r>
         <w:t xml:space="preserve">………………………………………………………………………………</w:t>
@@ -1883,6 +2048,7 @@
     <w:p>
       <w:pPr>
         <w:pStyle w:val="BodyText"/>
+        <w:spacing w:before="0" w:after="60" w:line="240" w:lineRule="auto"/>
       </w:pPr>
       <w:r>
         <w:t xml:space="preserve">………………………………………………………………………………</w:t>
@@ -1891,6 +2057,7 @@
     <w:p>
       <w:pPr>
         <w:pStyle w:val="BodyText"/>
+        <w:spacing w:before="0" w:after="60" w:line="240" w:lineRule="auto"/>
       </w:pPr>
       <w:r>
         <w:t xml:space="preserve">………………………………………………………………………………</w:t>
@@ -1899,6 +2066,7 @@
     <w:p>
       <w:pPr>
         <w:pStyle w:val="BodyText"/>
+        <w:spacing w:before="0" w:after="60" w:line="240" w:lineRule="auto"/>
       </w:pPr>
       <w:r>
         <w:t xml:space="preserve">………………………………………………………………………………</w:t>
@@ -1907,6 +2075,7 @@
     <w:p>
       <w:pPr>
         <w:pStyle w:val="BodyText"/>
+        <w:spacing w:before="0" w:after="60" w:line="240" w:lineRule="auto"/>
       </w:pPr>
       <w:r>
         <w:t xml:space="preserve">………………………………………………………………………………</w:t>
@@ -1915,6 +2084,7 @@
     <w:p>
       <w:pPr>
         <w:pStyle w:val="BodyText"/>
+        <w:spacing w:before="0" w:after="60" w:line="240" w:lineRule="auto"/>
       </w:pPr>
       <w:r>
         <w:t xml:space="preserve">………………………………………………………………………………</w:t>
@@ -1923,6 +2093,7 @@
     <w:p>
       <w:pPr>
         <w:pStyle w:val="BodyText"/>
+        <w:spacing w:before="0" w:after="60" w:line="240" w:lineRule="auto"/>
       </w:pPr>
       <w:r>
         <w:t xml:space="preserve">………………………………………………………………………………</w:t>
@@ -1932,7 +2103,7 @@
     <w:bookmarkEnd w:id="33"/>
     <w:sectPr>
       <w:pgSz w:h="16838" w:w="11906"/>
-      <w:pgMar w:bottom="1020" w:left="1020" w:right="1020" w:top="1020"/>
+      <w:pgMar w:bottom="680" w:left="737" w:right="737" w:top="680" w:header="340" w:footer="340"/>
     </w:sectPr>
   </w:body>
 </w:document>
@@ -2588,7 +2759,7 @@
       <w:spacing w:after="0" w:before="300"/>
     </w:pPr>
     <w:rPr>
-      <w:sz w:val="20"/>
+      <w:sz w:val="22"/>
       <w:szCs w:val="20"/>
       <w:rFonts w:ascii="Arial" w:cs="Arial" w:eastAsia="Arial" w:hAnsi="Arial"/>
       <w:b/>
@@ -2608,7 +2779,7 @@
     </w:pPr>
     <w:rPr>
       <w:rFonts w:ascii="Arial" w:cs="Arial" w:eastAsia="Arial" w:hAnsi="Arial"/>
-      <w:sz w:val="20"/>
+      <w:sz w:val="22"/>
       <w:szCs w:val="20"/>
     </w:rPr>
   </w:style>

</xml_diff>

<commit_message>
Repaginate worksheets: no task split across sides, content balanced per side
Co-Authored-By: Claude Opus 5.5 <noreply@anthropic.com>
Claude-Session: https://claude.ai/code/session_01WeyJoxdqkgaWP2E9bmUhY7
</commit_message>
<xml_diff>
--- a/e1/speaking-listening/docs/quiet-tasks-mixed-skills-worksheet.docx
+++ b/e1/speaking-listening/docs/quiet-tasks-mixed-skills-worksheet.docx
@@ -5,6 +5,7 @@
     <w:p>
       <w:pPr>
         <w:pStyle w:val="FirstParagraph"/>
+        <w:keepNext/>
         <w:spacing w:before="0" w:after="60" w:line="240" w:lineRule="auto"/>
       </w:pPr>
       <w:r>
@@ -54,6 +55,7 @@
     <w:p>
       <w:pPr>
         <w:pStyle w:val="Heading1"/>
+        <w:keepNext/>
         <w:spacing w:before="120" w:after="40" w:line="240" w:lineRule="auto"/>
       </w:pPr>
       <w:r>
@@ -63,6 +65,7 @@
     <w:p>
       <w:pPr>
         <w:pStyle w:val="FirstParagraph"/>
+        <w:keepNext/>
         <w:spacing w:before="0" w:after="60" w:line="240" w:lineRule="auto"/>
       </w:pPr>
       <w:r>
@@ -79,7 +82,8 @@
     <w:p>
       <w:pPr>
         <w:pStyle w:val="Heading2"/>
-        <w:spacing w:before="120" w:after="40" w:line="240" w:lineRule="auto"/>
+        <w:keepNext/>
+        <w:spacing w:before="840" w:after="40" w:line="240" w:lineRule="auto"/>
       </w:pPr>
       <w:r>
         <w:t xml:space="preserve">Task 1: Fill in the form</w:t>
@@ -88,6 +92,7 @@
     <w:p>
       <w:pPr>
         <w:pStyle w:val="FirstParagraph"/>
+        <w:keepNext/>
         <w:spacing w:before="0" w:after="60" w:line="240" w:lineRule="auto"/>
       </w:pPr>
       <w:r>
@@ -122,6 +127,7 @@
           <w:p>
             <w:pPr>
               <w:pStyle w:val="Compact"/>
+              <w:keepNext/>
               <w:spacing w:before="0" w:after="60" w:line="240" w:lineRule="auto"/>
               <w:jc w:val="left"/>
             </w:pPr>
@@ -135,6 +141,7 @@
           <w:p>
             <w:pPr>
               <w:pStyle w:val="Compact"/>
+              <w:keepNext/>
               <w:spacing w:before="0" w:after="60" w:line="240" w:lineRule="auto"/>
               <w:jc w:val="left"/>
             </w:pPr>
@@ -150,6 +157,7 @@
           <w:p>
             <w:pPr>
               <w:pStyle w:val="Compact"/>
+              <w:keepNext/>
               <w:spacing w:before="0" w:after="60" w:line="240" w:lineRule="auto"/>
               <w:jc w:val="left"/>
             </w:pPr>
@@ -163,6 +171,7 @@
           <w:p>
             <w:pPr>
               <w:pStyle w:val="Compact"/>
+              <w:keepNext/>
               <w:spacing w:before="0" w:after="60" w:line="240" w:lineRule="auto"/>
             </w:pPr>
           </w:p>
@@ -174,6 +183,7 @@
           <w:p>
             <w:pPr>
               <w:pStyle w:val="Compact"/>
+              <w:keepNext/>
               <w:spacing w:before="0" w:after="60" w:line="240" w:lineRule="auto"/>
               <w:jc w:val="left"/>
             </w:pPr>
@@ -187,6 +197,7 @@
           <w:p>
             <w:pPr>
               <w:pStyle w:val="Compact"/>
+              <w:keepNext/>
               <w:spacing w:before="0" w:after="60" w:line="240" w:lineRule="auto"/>
             </w:pPr>
           </w:p>
@@ -198,6 +209,7 @@
           <w:p>
             <w:pPr>
               <w:pStyle w:val="Compact"/>
+              <w:keepNext/>
               <w:spacing w:before="0" w:after="60" w:line="240" w:lineRule="auto"/>
               <w:jc w:val="left"/>
             </w:pPr>
@@ -211,6 +223,7 @@
           <w:p>
             <w:pPr>
               <w:pStyle w:val="Compact"/>
+              <w:keepNext/>
               <w:spacing w:before="0" w:after="60" w:line="240" w:lineRule="auto"/>
             </w:pPr>
           </w:p>
@@ -222,6 +235,7 @@
           <w:p>
             <w:pPr>
               <w:pStyle w:val="Compact"/>
+              <w:keepNext/>
               <w:spacing w:before="0" w:after="60" w:line="240" w:lineRule="auto"/>
               <w:jc w:val="left"/>
             </w:pPr>
@@ -235,6 +249,7 @@
           <w:p>
             <w:pPr>
               <w:pStyle w:val="Compact"/>
+              <w:keepNext/>
               <w:spacing w:before="0" w:after="60" w:line="240" w:lineRule="auto"/>
             </w:pPr>
           </w:p>
@@ -246,6 +261,7 @@
           <w:p>
             <w:pPr>
               <w:pStyle w:val="Compact"/>
+              <w:keepNext/>
               <w:spacing w:before="0" w:after="60" w:line="240" w:lineRule="auto"/>
               <w:jc w:val="left"/>
             </w:pPr>
@@ -259,6 +275,7 @@
           <w:p>
             <w:pPr>
               <w:pStyle w:val="Compact"/>
+              <w:keepNext/>
               <w:spacing w:before="0" w:after="60" w:line="240" w:lineRule="auto"/>
             </w:pPr>
           </w:p>
@@ -270,6 +287,7 @@
           <w:p>
             <w:pPr>
               <w:pStyle w:val="Compact"/>
+              <w:keepNext/>
               <w:spacing w:before="0" w:after="60" w:line="240" w:lineRule="auto"/>
               <w:jc w:val="left"/>
             </w:pPr>
@@ -283,6 +301,7 @@
           <w:p>
             <w:pPr>
               <w:pStyle w:val="Compact"/>
+              <w:keepNext/>
               <w:spacing w:before="0" w:after="60" w:line="240" w:lineRule="auto"/>
             </w:pPr>
           </w:p>
@@ -294,6 +313,7 @@
           <w:p>
             <w:pPr>
               <w:pStyle w:val="Compact"/>
+              <w:keepNext/>
               <w:spacing w:before="0" w:after="60" w:line="240" w:lineRule="auto"/>
               <w:jc w:val="left"/>
             </w:pPr>
@@ -307,6 +327,7 @@
           <w:p>
             <w:pPr>
               <w:pStyle w:val="Compact"/>
+              <w:keepNext/>
               <w:spacing w:before="0" w:after="60" w:line="240" w:lineRule="auto"/>
             </w:pPr>
           </w:p>
@@ -318,7 +339,8 @@
     <w:p>
       <w:pPr>
         <w:pStyle w:val="Heading2"/>
-        <w:spacing w:before="120" w:after="40" w:line="240" w:lineRule="auto"/>
+        <w:keepNext/>
+        <w:spacing w:before="840" w:after="40" w:line="240" w:lineRule="auto"/>
       </w:pPr>
       <w:r>
         <w:t xml:space="preserve">Task 2: About me</w:t>
@@ -327,6 +349,7 @@
     <w:p>
       <w:pPr>
         <w:pStyle w:val="FirstParagraph"/>
+        <w:keepNext/>
         <w:spacing w:before="0" w:after="60" w:line="240" w:lineRule="auto"/>
       </w:pPr>
       <w:r>
@@ -335,6 +358,7 @@
     </w:p>
     <w:p>
       <w:pPr>
+        <w:keepNext/>
         <w:numPr>
           <w:ilvl w:val="0"/>
           <w:numId w:val="1001"/>
@@ -348,6 +372,7 @@
     </w:p>
     <w:p>
       <w:pPr>
+        <w:keepNext/>
         <w:numPr>
           <w:ilvl w:val="0"/>
           <w:numId w:val="1001"/>
@@ -361,6 +386,7 @@
     </w:p>
     <w:p>
       <w:pPr>
+        <w:keepNext/>
         <w:numPr>
           <w:ilvl w:val="0"/>
           <w:numId w:val="1001"/>
@@ -374,6 +400,7 @@
     </w:p>
     <w:p>
       <w:pPr>
+        <w:keepNext/>
         <w:numPr>
           <w:ilvl w:val="0"/>
           <w:numId w:val="1001"/>
@@ -387,6 +414,7 @@
     </w:p>
     <w:p>
       <w:pPr>
+        <w:keepNext/>
         <w:numPr>
           <w:ilvl w:val="0"/>
           <w:numId w:val="1001"/>
@@ -400,6 +428,7 @@
     </w:p>
     <w:p>
       <w:pPr>
+        <w:keepNext/>
         <w:numPr>
           <w:ilvl w:val="0"/>
           <w:numId w:val="1001"/>
@@ -416,6 +445,8 @@
     <w:p>
       <w:pPr>
         <w:pStyle w:val="Heading2"/>
+        <w:keepNext/>
+        <w:pageBreakBefore/>
         <w:spacing w:before="120" w:after="40" w:line="240" w:lineRule="auto"/>
       </w:pPr>
       <w:r>
@@ -425,6 +456,7 @@
     <w:p>
       <w:pPr>
         <w:pStyle w:val="FirstParagraph"/>
+        <w:keepNext/>
         <w:spacing w:before="0" w:after="60" w:line="240" w:lineRule="auto"/>
       </w:pPr>
       <w:r>
@@ -461,6 +493,7 @@
           <w:p>
             <w:pPr>
               <w:pStyle w:val="Compact"/>
+              <w:keepNext/>
               <w:spacing w:before="0" w:after="60" w:line="240" w:lineRule="auto"/>
               <w:jc w:val="left"/>
             </w:pPr>
@@ -474,6 +507,7 @@
           <w:p>
             <w:pPr>
               <w:pStyle w:val="Compact"/>
+              <w:keepNext/>
               <w:spacing w:before="0" w:after="60" w:line="240" w:lineRule="auto"/>
               <w:jc w:val="left"/>
             </w:pPr>
@@ -487,6 +521,7 @@
           <w:p>
             <w:pPr>
               <w:pStyle w:val="Compact"/>
+              <w:keepNext/>
               <w:spacing w:before="0" w:after="60" w:line="240" w:lineRule="auto"/>
               <w:jc w:val="left"/>
             </w:pPr>
@@ -500,6 +535,7 @@
           <w:p>
             <w:pPr>
               <w:pStyle w:val="Compact"/>
+              <w:keepNext/>
               <w:spacing w:before="0" w:after="60" w:line="240" w:lineRule="auto"/>
               <w:jc w:val="left"/>
             </w:pPr>
@@ -515,6 +551,7 @@
           <w:p>
             <w:pPr>
               <w:pStyle w:val="Compact"/>
+              <w:keepNext/>
               <w:spacing w:before="0" w:after="60" w:line="240" w:lineRule="auto"/>
               <w:jc w:val="left"/>
             </w:pPr>
@@ -528,6 +565,7 @@
           <w:p>
             <w:pPr>
               <w:pStyle w:val="Compact"/>
+              <w:keepNext/>
               <w:spacing w:before="0" w:after="60" w:line="240" w:lineRule="auto"/>
               <w:jc w:val="left"/>
             </w:pPr>
@@ -541,6 +579,7 @@
           <w:p>
             <w:pPr>
               <w:pStyle w:val="Compact"/>
+              <w:keepNext/>
               <w:spacing w:before="0" w:after="60" w:line="240" w:lineRule="auto"/>
               <w:jc w:val="left"/>
             </w:pPr>
@@ -554,6 +593,7 @@
           <w:p>
             <w:pPr>
               <w:pStyle w:val="Compact"/>
+              <w:keepNext/>
               <w:spacing w:before="0" w:after="60" w:line="240" w:lineRule="auto"/>
               <w:jc w:val="left"/>
             </w:pPr>
@@ -569,6 +609,7 @@
           <w:p>
             <w:pPr>
               <w:pStyle w:val="Compact"/>
+              <w:keepNext/>
               <w:spacing w:before="0" w:after="60" w:line="240" w:lineRule="auto"/>
               <w:jc w:val="left"/>
             </w:pPr>
@@ -582,6 +623,7 @@
           <w:p>
             <w:pPr>
               <w:pStyle w:val="Compact"/>
+              <w:keepNext/>
               <w:spacing w:before="0" w:after="60" w:line="240" w:lineRule="auto"/>
               <w:jc w:val="left"/>
             </w:pPr>
@@ -595,6 +637,7 @@
           <w:p>
             <w:pPr>
               <w:pStyle w:val="Compact"/>
+              <w:keepNext/>
               <w:spacing w:before="0" w:after="60" w:line="240" w:lineRule="auto"/>
               <w:jc w:val="left"/>
             </w:pPr>
@@ -608,6 +651,7 @@
           <w:p>
             <w:pPr>
               <w:pStyle w:val="Compact"/>
+              <w:keepNext/>
               <w:spacing w:before="0" w:after="60" w:line="240" w:lineRule="auto"/>
               <w:jc w:val="left"/>
             </w:pPr>
@@ -623,6 +667,7 @@
           <w:p>
             <w:pPr>
               <w:pStyle w:val="Compact"/>
+              <w:keepNext/>
               <w:spacing w:before="0" w:after="60" w:line="240" w:lineRule="auto"/>
               <w:jc w:val="left"/>
             </w:pPr>
@@ -636,6 +681,7 @@
           <w:p>
             <w:pPr>
               <w:pStyle w:val="Compact"/>
+              <w:keepNext/>
               <w:spacing w:before="0" w:after="60" w:line="240" w:lineRule="auto"/>
               <w:jc w:val="left"/>
             </w:pPr>
@@ -649,6 +695,7 @@
           <w:p>
             <w:pPr>
               <w:pStyle w:val="Compact"/>
+              <w:keepNext/>
               <w:spacing w:before="0" w:after="60" w:line="240" w:lineRule="auto"/>
               <w:jc w:val="left"/>
             </w:pPr>
@@ -662,6 +709,7 @@
           <w:p>
             <w:pPr>
               <w:pStyle w:val="Compact"/>
+              <w:keepNext/>
               <w:spacing w:before="0" w:after="60" w:line="240" w:lineRule="auto"/>
               <w:jc w:val="left"/>
             </w:pPr>
@@ -677,6 +725,7 @@
           <w:p>
             <w:pPr>
               <w:pStyle w:val="Compact"/>
+              <w:keepNext/>
               <w:spacing w:before="0" w:after="60" w:line="240" w:lineRule="auto"/>
               <w:jc w:val="left"/>
             </w:pPr>
@@ -690,6 +739,7 @@
           <w:p>
             <w:pPr>
               <w:pStyle w:val="Compact"/>
+              <w:keepNext/>
               <w:spacing w:before="0" w:after="60" w:line="240" w:lineRule="auto"/>
               <w:jc w:val="left"/>
             </w:pPr>
@@ -703,6 +753,7 @@
           <w:p>
             <w:pPr>
               <w:pStyle w:val="Compact"/>
+              <w:keepNext/>
               <w:spacing w:before="0" w:after="60" w:line="240" w:lineRule="auto"/>
               <w:jc w:val="left"/>
             </w:pPr>
@@ -716,6 +767,7 @@
           <w:p>
             <w:pPr>
               <w:pStyle w:val="Compact"/>
+              <w:keepNext/>
               <w:spacing w:before="0" w:after="60" w:line="240" w:lineRule="auto"/>
               <w:jc w:val="left"/>
             </w:pPr>
@@ -731,6 +783,7 @@
           <w:p>
             <w:pPr>
               <w:pStyle w:val="Compact"/>
+              <w:keepNext/>
               <w:spacing w:before="0" w:after="60" w:line="240" w:lineRule="auto"/>
               <w:jc w:val="left"/>
             </w:pPr>
@@ -744,6 +797,7 @@
           <w:p>
             <w:pPr>
               <w:pStyle w:val="Compact"/>
+              <w:keepNext/>
               <w:spacing w:before="0" w:after="60" w:line="240" w:lineRule="auto"/>
               <w:jc w:val="left"/>
             </w:pPr>
@@ -757,6 +811,7 @@
           <w:p>
             <w:pPr>
               <w:pStyle w:val="Compact"/>
+              <w:keepNext/>
               <w:spacing w:before="0" w:after="60" w:line="240" w:lineRule="auto"/>
               <w:jc w:val="left"/>
             </w:pPr>
@@ -770,6 +825,7 @@
           <w:p>
             <w:pPr>
               <w:pStyle w:val="Compact"/>
+              <w:keepNext/>
               <w:spacing w:before="0" w:after="60" w:line="240" w:lineRule="auto"/>
               <w:jc w:val="left"/>
             </w:pPr>
@@ -782,6 +838,7 @@
     </w:tbl>
     <w:p>
       <w:pPr>
+        <w:keepNext/>
         <w:numPr>
           <w:ilvl w:val="0"/>
           <w:numId w:val="1002"/>
@@ -795,6 +852,7 @@
     </w:p>
     <w:p>
       <w:pPr>
+        <w:keepNext/>
         <w:numPr>
           <w:ilvl w:val="0"/>
           <w:numId w:val="1002"/>
@@ -808,6 +866,7 @@
     </w:p>
     <w:p>
       <w:pPr>
+        <w:keepNext/>
         <w:numPr>
           <w:ilvl w:val="0"/>
           <w:numId w:val="1002"/>
@@ -821,6 +880,7 @@
     </w:p>
     <w:p>
       <w:pPr>
+        <w:keepNext/>
         <w:numPr>
           <w:ilvl w:val="0"/>
           <w:numId w:val="1002"/>
@@ -834,6 +894,7 @@
     </w:p>
     <w:p>
       <w:pPr>
+        <w:keepNext/>
         <w:numPr>
           <w:ilvl w:val="0"/>
           <w:numId w:val="1002"/>
@@ -847,6 +908,7 @@
     </w:p>
     <w:p>
       <w:pPr>
+        <w:keepNext/>
         <w:numPr>
           <w:ilvl w:val="0"/>
           <w:numId w:val="1002"/>
@@ -864,7 +926,7 @@
       <w:pPr>
         <w:pStyle w:val="Heading2"/>
         <w:keepNext/>
-        <w:spacing w:before="120" w:after="40" w:line="240" w:lineRule="auto"/>
+        <w:spacing w:before="840" w:after="40" w:line="240" w:lineRule="auto"/>
       </w:pPr>
       <w:r>
         <w:t xml:space="preserve">Task 4: A to Z</w:t>
@@ -1011,7 +1073,8 @@
     <w:p>
       <w:pPr>
         <w:pStyle w:val="Heading2"/>
-        <w:spacing w:before="120" w:after="40" w:line="240" w:lineRule="auto"/>
+        <w:keepNext/>
+        <w:spacing w:before="840" w:after="40" w:line="240" w:lineRule="auto"/>
       </w:pPr>
       <w:r>
         <w:t xml:space="preserve">Task 5: Last weekend</w:t>
@@ -1020,6 +1083,7 @@
     <w:p>
       <w:pPr>
         <w:pStyle w:val="FirstParagraph"/>
+        <w:keepNext/>
         <w:spacing w:before="0" w:after="60" w:line="240" w:lineRule="auto"/>
       </w:pPr>
       <w:r>
@@ -1028,6 +1092,7 @@
     </w:p>
     <w:p>
       <w:pPr>
+        <w:keepNext/>
         <w:numPr>
           <w:ilvl w:val="0"/>
           <w:numId w:val="1004"/>
@@ -1041,6 +1106,7 @@
     </w:p>
     <w:p>
       <w:pPr>
+        <w:keepNext/>
         <w:numPr>
           <w:ilvl w:val="0"/>
           <w:numId w:val="1004"/>
@@ -1054,6 +1120,7 @@
     </w:p>
     <w:p>
       <w:pPr>
+        <w:keepNext/>
         <w:numPr>
           <w:ilvl w:val="0"/>
           <w:numId w:val="1004"/>
@@ -1067,6 +1134,7 @@
     </w:p>
     <w:p>
       <w:pPr>
+        <w:keepNext/>
         <w:numPr>
           <w:ilvl w:val="0"/>
           <w:numId w:val="1004"/>
@@ -1080,6 +1148,7 @@
     </w:p>
     <w:p>
       <w:pPr>
+        <w:keepNext/>
         <w:numPr>
           <w:ilvl w:val="0"/>
           <w:numId w:val="1004"/>
@@ -1093,6 +1162,7 @@
     </w:p>
     <w:p>
       <w:pPr>
+        <w:keepNext/>
         <w:numPr>
           <w:ilvl w:val="0"/>
           <w:numId w:val="1004"/>
@@ -1106,6 +1176,7 @@
     </w:p>
     <w:p>
       <w:pPr>
+        <w:keepNext/>
         <w:numPr>
           <w:ilvl w:val="0"/>
           <w:numId w:val="1004"/>
@@ -1119,6 +1190,7 @@
     </w:p>
     <w:p>
       <w:pPr>
+        <w:keepNext/>
         <w:numPr>
           <w:ilvl w:val="0"/>
           <w:numId w:val="1004"/>
@@ -1133,6 +1205,7 @@
     <w:p>
       <w:pPr>
         <w:pStyle w:val="FirstParagraph"/>
+        <w:keepNext/>
         <w:spacing w:before="0" w:after="60" w:line="240" w:lineRule="auto"/>
       </w:pPr>
       <w:r>
@@ -1141,6 +1214,7 @@
     </w:p>
     <w:p>
       <w:pPr>
+        <w:keepNext/>
         <w:numPr>
           <w:ilvl w:val="0"/>
           <w:numId w:val="1005"/>
@@ -1154,6 +1228,7 @@
     </w:p>
     <w:p>
       <w:pPr>
+        <w:keepNext/>
         <w:numPr>
           <w:ilvl w:val="0"/>
           <w:numId w:val="1005"/>
@@ -1167,6 +1242,7 @@
     </w:p>
     <w:p>
       <w:pPr>
+        <w:keepNext/>
         <w:numPr>
           <w:ilvl w:val="0"/>
           <w:numId w:val="1005"/>
@@ -1183,6 +1259,8 @@
     <w:p>
       <w:pPr>
         <w:pStyle w:val="Heading2"/>
+        <w:keepNext/>
+        <w:pageBreakBefore/>
         <w:spacing w:before="120" w:after="40" w:line="240" w:lineRule="auto"/>
       </w:pPr>
       <w:r>
@@ -1192,6 +1270,7 @@
     <w:p>
       <w:pPr>
         <w:pStyle w:val="FirstParagraph"/>
+        <w:keepNext/>
         <w:spacing w:before="0" w:after="60" w:line="240" w:lineRule="auto"/>
       </w:pPr>
       <w:r>
@@ -1226,6 +1305,7 @@
           <w:p>
             <w:pPr>
               <w:pStyle w:val="Compact"/>
+              <w:keepNext/>
               <w:spacing w:before="0" w:after="60" w:line="240" w:lineRule="auto"/>
               <w:jc w:val="left"/>
             </w:pPr>
@@ -1239,6 +1319,7 @@
           <w:p>
             <w:pPr>
               <w:pStyle w:val="Compact"/>
+              <w:keepNext/>
               <w:spacing w:before="0" w:after="60" w:line="240" w:lineRule="auto"/>
               <w:jc w:val="left"/>
             </w:pPr>
@@ -1254,6 +1335,7 @@
           <w:p>
             <w:pPr>
               <w:pStyle w:val="Compact"/>
+              <w:keepNext/>
               <w:spacing w:before="0" w:after="60" w:line="240" w:lineRule="auto"/>
               <w:jc w:val="left"/>
             </w:pPr>
@@ -1267,6 +1349,7 @@
           <w:p>
             <w:pPr>
               <w:pStyle w:val="Compact"/>
+              <w:keepNext/>
               <w:spacing w:before="0" w:after="60" w:line="240" w:lineRule="auto"/>
               <w:jc w:val="left"/>
             </w:pPr>
@@ -1282,6 +1365,7 @@
           <w:p>
             <w:pPr>
               <w:pStyle w:val="Compact"/>
+              <w:keepNext/>
               <w:spacing w:before="0" w:after="60" w:line="240" w:lineRule="auto"/>
               <w:jc w:val="left"/>
             </w:pPr>
@@ -1295,6 +1379,7 @@
           <w:p>
             <w:pPr>
               <w:pStyle w:val="Compact"/>
+              <w:keepNext/>
               <w:spacing w:before="0" w:after="60" w:line="240" w:lineRule="auto"/>
               <w:jc w:val="left"/>
             </w:pPr>
@@ -1310,6 +1395,7 @@
           <w:p>
             <w:pPr>
               <w:pStyle w:val="Compact"/>
+              <w:keepNext/>
               <w:spacing w:before="0" w:after="60" w:line="240" w:lineRule="auto"/>
               <w:jc w:val="left"/>
             </w:pPr>
@@ -1323,6 +1409,7 @@
           <w:p>
             <w:pPr>
               <w:pStyle w:val="Compact"/>
+              <w:keepNext/>
               <w:spacing w:before="0" w:after="60" w:line="240" w:lineRule="auto"/>
               <w:jc w:val="left"/>
             </w:pPr>
@@ -1338,6 +1425,7 @@
           <w:p>
             <w:pPr>
               <w:pStyle w:val="Compact"/>
+              <w:keepNext/>
               <w:spacing w:before="0" w:after="60" w:line="240" w:lineRule="auto"/>
               <w:jc w:val="left"/>
             </w:pPr>
@@ -1351,6 +1439,7 @@
           <w:p>
             <w:pPr>
               <w:pStyle w:val="Compact"/>
+              <w:keepNext/>
               <w:spacing w:before="0" w:after="60" w:line="240" w:lineRule="auto"/>
               <w:jc w:val="left"/>
             </w:pPr>
@@ -1366,6 +1455,7 @@
           <w:p>
             <w:pPr>
               <w:pStyle w:val="Compact"/>
+              <w:keepNext/>
               <w:spacing w:before="0" w:after="60" w:line="240" w:lineRule="auto"/>
               <w:jc w:val="left"/>
             </w:pPr>
@@ -1379,6 +1469,7 @@
           <w:p>
             <w:pPr>
               <w:pStyle w:val="Compact"/>
+              <w:keepNext/>
               <w:spacing w:before="0" w:after="60" w:line="240" w:lineRule="auto"/>
               <w:jc w:val="left"/>
             </w:pPr>
@@ -1394,6 +1485,7 @@
           <w:p>
             <w:pPr>
               <w:pStyle w:val="Compact"/>
+              <w:keepNext/>
               <w:spacing w:before="0" w:after="60" w:line="240" w:lineRule="auto"/>
               <w:jc w:val="left"/>
             </w:pPr>
@@ -1407,6 +1499,7 @@
           <w:p>
             <w:pPr>
               <w:pStyle w:val="Compact"/>
+              <w:keepNext/>
               <w:spacing w:before="0" w:after="60" w:line="240" w:lineRule="auto"/>
               <w:jc w:val="left"/>
             </w:pPr>
@@ -1420,6 +1513,7 @@
     <w:p>
       <w:pPr>
         <w:pStyle w:val="BodyText"/>
+        <w:keepNext/>
         <w:spacing w:before="0" w:after="60" w:line="240" w:lineRule="auto"/>
       </w:pPr>
       <w:r>
@@ -1428,6 +1522,7 @@
     </w:p>
     <w:p>
       <w:pPr>
+        <w:keepNext/>
         <w:numPr>
           <w:ilvl w:val="0"/>
           <w:numId w:val="1006"/>
@@ -1441,6 +1536,7 @@
     </w:p>
     <w:p>
       <w:pPr>
+        <w:keepNext/>
         <w:numPr>
           <w:ilvl w:val="0"/>
           <w:numId w:val="1006"/>
@@ -1454,6 +1550,7 @@
     </w:p>
     <w:p>
       <w:pPr>
+        <w:keepNext/>
         <w:numPr>
           <w:ilvl w:val="0"/>
           <w:numId w:val="1006"/>
@@ -1467,6 +1564,7 @@
     </w:p>
     <w:p>
       <w:pPr>
+        <w:keepNext/>
         <w:numPr>
           <w:ilvl w:val="0"/>
           <w:numId w:val="1006"/>
@@ -1480,6 +1578,7 @@
     </w:p>
     <w:p>
       <w:pPr>
+        <w:keepNext/>
         <w:numPr>
           <w:ilvl w:val="0"/>
           <w:numId w:val="1006"/>
@@ -1496,7 +1595,8 @@
     <w:p>
       <w:pPr>
         <w:pStyle w:val="Heading2"/>
-        <w:spacing w:before="120" w:after="40" w:line="240" w:lineRule="auto"/>
+        <w:keepNext/>
+        <w:spacing w:before="840" w:after="40" w:line="240" w:lineRule="auto"/>
       </w:pPr>
       <w:r>
         <w:t xml:space="preserve">Task 7: Read about Maria</w:t>
@@ -1505,6 +1605,7 @@
     <w:p>
       <w:pPr>
         <w:pStyle w:val="FirstParagraph"/>
+        <w:keepNext/>
         <w:spacing w:before="0" w:after="60" w:line="240" w:lineRule="auto"/>
       </w:pPr>
       <w:r>
@@ -1514,6 +1615,7 @@
     <w:p>
       <w:pPr>
         <w:pStyle w:val="BodyText"/>
+        <w:keepNext/>
         <w:spacing w:before="0" w:after="60" w:line="240" w:lineRule="auto"/>
       </w:pPr>
       <w:r>
@@ -1523,6 +1625,7 @@
     <w:p>
       <w:pPr>
         <w:pStyle w:val="BodyText"/>
+        <w:keepNext/>
         <w:spacing w:before="0" w:after="60" w:line="240" w:lineRule="auto"/>
       </w:pPr>
       <w:r>
@@ -1531,6 +1634,7 @@
     </w:p>
     <w:p>
       <w:pPr>
+        <w:keepNext/>
         <w:numPr>
           <w:ilvl w:val="0"/>
           <w:numId w:val="1007"/>
@@ -1544,6 +1648,7 @@
     </w:p>
     <w:p>
       <w:pPr>
+        <w:keepNext/>
         <w:numPr>
           <w:ilvl w:val="0"/>
           <w:numId w:val="1007"/>
@@ -1557,6 +1662,7 @@
     </w:p>
     <w:p>
       <w:pPr>
+        <w:keepNext/>
         <w:numPr>
           <w:ilvl w:val="0"/>
           <w:numId w:val="1007"/>
@@ -1570,6 +1676,7 @@
     </w:p>
     <w:p>
       <w:pPr>
+        <w:keepNext/>
         <w:numPr>
           <w:ilvl w:val="0"/>
           <w:numId w:val="1007"/>
@@ -1583,6 +1690,7 @@
     </w:p>
     <w:p>
       <w:pPr>
+        <w:keepNext/>
         <w:numPr>
           <w:ilvl w:val="0"/>
           <w:numId w:val="1007"/>
@@ -1596,6 +1704,7 @@
     </w:p>
     <w:p>
       <w:pPr>
+        <w:keepNext/>
         <w:numPr>
           <w:ilvl w:val="0"/>
           <w:numId w:val="1007"/>
@@ -1609,6 +1718,7 @@
     </w:p>
     <w:p>
       <w:pPr>
+        <w:keepNext/>
         <w:numPr>
           <w:ilvl w:val="0"/>
           <w:numId w:val="1007"/>
@@ -1622,6 +1732,7 @@
     </w:p>
     <w:p>
       <w:pPr>
+        <w:keepNext/>
         <w:numPr>
           <w:ilvl w:val="0"/>
           <w:numId w:val="1007"/>
@@ -1638,6 +1749,8 @@
     <w:p>
       <w:pPr>
         <w:pStyle w:val="Heading2"/>
+        <w:keepNext/>
+        <w:pageBreakBefore/>
         <w:spacing w:before="120" w:after="40" w:line="240" w:lineRule="auto"/>
       </w:pPr>
       <w:r>
@@ -1647,6 +1760,7 @@
     <w:p>
       <w:pPr>
         <w:pStyle w:val="FirstParagraph"/>
+        <w:keepNext/>
         <w:spacing w:before="0" w:after="60" w:line="240" w:lineRule="auto"/>
       </w:pPr>
       <w:r>
@@ -1655,6 +1769,7 @@
     </w:p>
     <w:p>
       <w:pPr>
+        <w:keepNext/>
         <w:numPr>
           <w:ilvl w:val="0"/>
           <w:numId w:val="1008"/>
@@ -1667,6 +1782,7 @@
     </w:p>
     <w:p>
       <w:pPr>
+        <w:keepNext/>
         <w:numPr>
           <w:ilvl w:val="0"/>
           <w:numId w:val="1000"/>
@@ -1679,6 +1795,7 @@
     </w:p>
     <w:p>
       <w:pPr>
+        <w:keepNext/>
         <w:numPr>
           <w:ilvl w:val="0"/>
           <w:numId w:val="1008"/>
@@ -1691,6 +1808,7 @@
     </w:p>
     <w:p>
       <w:pPr>
+        <w:keepNext/>
         <w:numPr>
           <w:ilvl w:val="0"/>
           <w:numId w:val="1000"/>
@@ -1703,6 +1821,7 @@
     </w:p>
     <w:p>
       <w:pPr>
+        <w:keepNext/>
         <w:numPr>
           <w:ilvl w:val="0"/>
           <w:numId w:val="1008"/>
@@ -1715,6 +1834,7 @@
     </w:p>
     <w:p>
       <w:pPr>
+        <w:keepNext/>
         <w:numPr>
           <w:ilvl w:val="0"/>
           <w:numId w:val="1000"/>
@@ -1727,6 +1847,7 @@
     </w:p>
     <w:p>
       <w:pPr>
+        <w:keepNext/>
         <w:numPr>
           <w:ilvl w:val="0"/>
           <w:numId w:val="1008"/>
@@ -1739,6 +1860,7 @@
     </w:p>
     <w:p>
       <w:pPr>
+        <w:keepNext/>
         <w:numPr>
           <w:ilvl w:val="0"/>
           <w:numId w:val="1000"/>
@@ -1751,6 +1873,7 @@
     </w:p>
     <w:p>
       <w:pPr>
+        <w:keepNext/>
         <w:numPr>
           <w:ilvl w:val="0"/>
           <w:numId w:val="1008"/>
@@ -1763,6 +1886,7 @@
     </w:p>
     <w:p>
       <w:pPr>
+        <w:keepNext/>
         <w:numPr>
           <w:ilvl w:val="0"/>
           <w:numId w:val="1000"/>
@@ -1775,6 +1899,7 @@
     </w:p>
     <w:p>
       <w:pPr>
+        <w:keepNext/>
         <w:numPr>
           <w:ilvl w:val="0"/>
           <w:numId w:val="1008"/>
@@ -1787,6 +1912,7 @@
     </w:p>
     <w:p>
       <w:pPr>
+        <w:keepNext/>
         <w:numPr>
           <w:ilvl w:val="0"/>
           <w:numId w:val="1000"/>
@@ -1802,7 +1928,8 @@
     <w:p>
       <w:pPr>
         <w:pStyle w:val="Heading2"/>
-        <w:spacing w:before="120" w:after="40" w:line="240" w:lineRule="auto"/>
+        <w:keepNext/>
+        <w:spacing w:before="819" w:after="40" w:line="240" w:lineRule="auto"/>
       </w:pPr>
       <w:r>
         <w:t xml:space="preserve">Task 9: A to Z, harder</w:t>
@@ -1811,6 +1938,7 @@
     <w:p>
       <w:pPr>
         <w:pStyle w:val="FirstParagraph"/>
+        <w:keepNext/>
         <w:spacing w:before="0" w:after="60" w:line="240" w:lineRule="auto"/>
       </w:pPr>
       <w:r>
@@ -1820,6 +1948,7 @@
     <w:p>
       <w:pPr>
         <w:pStyle w:val="BodyText"/>
+        <w:keepNext/>
         <w:spacing w:before="0" w:after="60" w:line="240" w:lineRule="auto"/>
       </w:pPr>
       <w:r>
@@ -1832,6 +1961,7 @@
     </w:p>
     <w:p>
       <w:pPr>
+        <w:keepNext/>
         <w:numPr>
           <w:ilvl w:val="0"/>
           <w:numId w:val="1009"/>
@@ -1845,6 +1975,7 @@
     </w:p>
     <w:p>
       <w:pPr>
+        <w:keepNext/>
         <w:numPr>
           <w:ilvl w:val="0"/>
           <w:numId w:val="1009"/>
@@ -1858,6 +1989,7 @@
     </w:p>
     <w:p>
       <w:pPr>
+        <w:keepNext/>
         <w:numPr>
           <w:ilvl w:val="0"/>
           <w:numId w:val="1009"/>
@@ -1871,6 +2003,7 @@
     </w:p>
     <w:p>
       <w:pPr>
+        <w:keepNext/>
         <w:numPr>
           <w:ilvl w:val="0"/>
           <w:numId w:val="1009"/>
@@ -1884,6 +2017,7 @@
     </w:p>
     <w:p>
       <w:pPr>
+        <w:keepNext/>
         <w:numPr>
           <w:ilvl w:val="0"/>
           <w:numId w:val="1009"/>
@@ -1897,6 +2031,7 @@
     </w:p>
     <w:p>
       <w:pPr>
+        <w:keepNext/>
         <w:numPr>
           <w:ilvl w:val="0"/>
           <w:numId w:val="1009"/>
@@ -1913,7 +2048,8 @@
     <w:p>
       <w:pPr>
         <w:pStyle w:val="Heading2"/>
-        <w:spacing w:before="120" w:after="40" w:line="240" w:lineRule="auto"/>
+        <w:keepNext/>
+        <w:spacing w:before="819" w:after="40" w:line="240" w:lineRule="auto"/>
       </w:pPr>
       <w:r>
         <w:t xml:space="preserve">Task 10: Write about you</w:t>
@@ -1922,6 +2058,7 @@
     <w:p>
       <w:pPr>
         <w:pStyle w:val="FirstParagraph"/>
+        <w:keepNext/>
         <w:spacing w:before="0" w:after="60" w:line="240" w:lineRule="auto"/>
       </w:pPr>
       <w:r>
@@ -1946,6 +2083,7 @@
     </w:p>
     <w:p>
       <w:pPr>
+        <w:keepNext/>
         <w:numPr>
           <w:ilvl w:val="0"/>
           <w:numId w:val="1010"/>
@@ -1959,6 +2097,7 @@
     </w:p>
     <w:p>
       <w:pPr>
+        <w:keepNext/>
         <w:numPr>
           <w:ilvl w:val="0"/>
           <w:numId w:val="1010"/>
@@ -1972,6 +2111,7 @@
     </w:p>
     <w:p>
       <w:pPr>
+        <w:keepNext/>
         <w:numPr>
           <w:ilvl w:val="0"/>
           <w:numId w:val="1010"/>
@@ -1985,6 +2125,7 @@
     </w:p>
     <w:p>
       <w:pPr>
+        <w:keepNext/>
         <w:numPr>
           <w:ilvl w:val="0"/>
           <w:numId w:val="1010"/>
@@ -1998,6 +2139,7 @@
     </w:p>
     <w:p>
       <w:pPr>
+        <w:keepNext/>
         <w:numPr>
           <w:ilvl w:val="0"/>
           <w:numId w:val="1010"/>
@@ -2012,6 +2154,7 @@
     <w:p>
       <w:pPr>
         <w:pStyle w:val="FirstParagraph"/>
+        <w:keepNext/>
         <w:spacing w:before="0" w:after="60" w:line="240" w:lineRule="auto"/>
       </w:pPr>
       <w:r>
@@ -2021,6 +2164,7 @@
     <w:p>
       <w:pPr>
         <w:pStyle w:val="BodyText"/>
+        <w:keepNext/>
         <w:spacing w:before="0" w:after="60" w:line="240" w:lineRule="auto"/>
       </w:pPr>
       <w:r>
@@ -2030,6 +2174,7 @@
     <w:p>
       <w:pPr>
         <w:pStyle w:val="BodyText"/>
+        <w:keepNext/>
         <w:spacing w:before="0" w:after="60" w:line="240" w:lineRule="auto"/>
       </w:pPr>
       <w:r>
@@ -2039,6 +2184,7 @@
     <w:p>
       <w:pPr>
         <w:pStyle w:val="BodyText"/>
+        <w:keepNext/>
         <w:spacing w:before="0" w:after="60" w:line="240" w:lineRule="auto"/>
       </w:pPr>
       <w:r>
@@ -2048,6 +2194,7 @@
     <w:p>
       <w:pPr>
         <w:pStyle w:val="BodyText"/>
+        <w:keepNext/>
         <w:spacing w:before="0" w:after="60" w:line="240" w:lineRule="auto"/>
       </w:pPr>
       <w:r>
@@ -2057,6 +2204,7 @@
     <w:p>
       <w:pPr>
         <w:pStyle w:val="BodyText"/>
+        <w:keepNext/>
         <w:spacing w:before="0" w:after="60" w:line="240" w:lineRule="auto"/>
       </w:pPr>
       <w:r>
@@ -2066,6 +2214,7 @@
     <w:p>
       <w:pPr>
         <w:pStyle w:val="BodyText"/>
+        <w:keepNext/>
         <w:spacing w:before="0" w:after="60" w:line="240" w:lineRule="auto"/>
       </w:pPr>
       <w:r>
@@ -2075,6 +2224,7 @@
     <w:p>
       <w:pPr>
         <w:pStyle w:val="BodyText"/>
+        <w:keepNext/>
         <w:spacing w:before="0" w:after="60" w:line="240" w:lineRule="auto"/>
       </w:pPr>
       <w:r>
@@ -2084,6 +2234,7 @@
     <w:p>
       <w:pPr>
         <w:pStyle w:val="BodyText"/>
+        <w:keepNext/>
         <w:spacing w:before="0" w:after="60" w:line="240" w:lineRule="auto"/>
       </w:pPr>
       <w:r>
@@ -2093,6 +2244,7 @@
     <w:p>
       <w:pPr>
         <w:pStyle w:val="BodyText"/>
+        <w:keepNext/>
         <w:spacing w:before="0" w:after="60" w:line="240" w:lineRule="auto"/>
       </w:pPr>
       <w:r>

</xml_diff>